<commit_message>
Fix incorrect split-comparison claim, misstated day count, dead reference URL, and citation ordering
</commit_message>
<xml_diff>
--- a/paper/PESA_Full_Paper.docx
+++ b/paper/PESA_Full_Paper.docx
@@ -1,6 +1,6 @@
 
 <file path=word/document.xml><?xml version="1.0" encoding="utf-8"?>
-<w:document xmlns:cx="http://schemas.microsoft.com/office/drawing/2014/chartex" xmlns:cx1="http://schemas.microsoft.com/office/drawing/2015/9/8/chartex" xmlns:cx2="http://schemas.microsoft.com/office/drawing/2015/10/21/chartex" xmlns:cx3="http://schemas.microsoft.com/office/drawing/2016/5/9/chartex" xmlns:cx4="http://schemas.microsoft.com/office/drawing/2016/5/10/chartex" xmlns:cx5="http://schemas.microsoft.com/office/drawing/2016/5/11/chartex" xmlns:cx6="http://schemas.microsoft.com/office/drawing/2016/5/12/chartex" xmlns:cx7="http://schemas.microsoft.com/office/drawing/2016/5/13/chartex" xmlns:cx8="http://schemas.microsoft.com/office/drawing/2016/5/14/chartex" xmlns:mc="http://schemas.openxmlformats.org/markup-compatibility/2006" xmlns:aink="http://schemas.microsoft.com/office/drawing/2016/ink" xmlns:am3d="http://schemas.microsoft.com/office/drawing/2017/model3d" xmlns:o="urn:schemas-microsoft-com:office:office" xmlns:oel="http://schemas.microsoft.com/office/2019/extlst" xmlns:r="http://purl.oclc.org/ooxml/officeDocument/relationships" xmlns:m="http://purl.oclc.org/ooxml/officeDocument/math" xmlns:v="urn:schemas-microsoft-com:vml" xmlns:wp14="http://schemas.microsoft.com/office/word/2010/wordprocessingDrawing" xmlns:wp="http://purl.oclc.org/ooxml/drawingml/wordprocessingDrawing" xmlns:w10="urn:schemas-microsoft-com:office:word" xmlns:w="http://purl.oclc.org/ooxml/wordprocessingml/main" xmlns:w14="http://schemas.microsoft.com/office/word/2010/wordml" xmlns:w15="http://schemas.microsoft.com/office/word/2012/wordml" xmlns:w16cex="http://schemas.microsoft.com/office/word/2018/wordml/cex" xmlns:w16cid="http://schemas.microsoft.com/office/word/2016/wordml/cid" xmlns:w16="http://schemas.microsoft.com/office/word/2018/wordml" xmlns:w16sdtdh="http://schemas.microsoft.com/office/word/2020/wordml/sdtdatahash" xmlns:w16se="http://schemas.microsoft.com/office/word/2015/wordml/symex" xmlns:wpi="http://schemas.microsoft.com/office/word/2010/wordprocessingInk" xmlns:wne="http://schemas.microsoft.com/office/word/2006/wordml" mc:Ignorable="w14 w15 w16se w16cid w16 w16cex w16sdtdh wne wp14" w:conformance="strict">
+<w:document xmlns:cx="http://schemas.microsoft.com/office/drawing/2014/chartex" xmlns:cx1="http://schemas.microsoft.com/office/drawing/2015/9/8/chartex" xmlns:cx2="http://schemas.microsoft.com/office/drawing/2015/10/21/chartex" xmlns:cx3="http://schemas.microsoft.com/office/drawing/2016/5/9/chartex" xmlns:cx4="http://schemas.microsoft.com/office/drawing/2016/5/10/chartex" xmlns:cx5="http://schemas.microsoft.com/office/drawing/2016/5/11/chartex" xmlns:cx6="http://schemas.microsoft.com/office/drawing/2016/5/12/chartex" xmlns:cx7="http://schemas.microsoft.com/office/drawing/2016/5/13/chartex" xmlns:cx8="http://schemas.microsoft.com/office/drawing/2016/5/14/chartex" xmlns:mc="http://schemas.openxmlformats.org/markup-compatibility/2006" xmlns:aink="http://schemas.microsoft.com/office/drawing/2016/ink" xmlns:am3d="http://schemas.microsoft.com/office/drawing/2017/model3d" xmlns:o="urn:schemas-microsoft-com:office:office" xmlns:oel="http://schemas.microsoft.com/office/2019/extlst" xmlns:r="http://schemas.openxmlformats.org/officeDocument/2006/relationships" xmlns:m="http://schemas.openxmlformats.org/officeDocument/2006/math" xmlns:v="urn:schemas-microsoft-com:vml" xmlns:wp14="http://schemas.microsoft.com/office/word/2010/wordprocessingDrawing" xmlns:wp="http://schemas.openxmlformats.org/drawingml/2006/wordprocessingDrawing" xmlns:w10="urn:schemas-microsoft-com:office:word" xmlns:w="http://schemas.openxmlformats.org/wordprocessingml/2006/main" xmlns:w14="http://schemas.microsoft.com/office/word/2010/wordml" xmlns:w15="http://schemas.microsoft.com/office/word/2012/wordml" xmlns:w16cex="http://schemas.microsoft.com/office/word/2018/wordml/cex" xmlns:w16cid="http://schemas.microsoft.com/office/word/2016/wordml/cid" xmlns:w16="http://schemas.microsoft.com/office/word/2018/wordml" xmlns:w16sdtdh="http://schemas.microsoft.com/office/word/2020/wordml/sdtdatahash" xmlns:w16se="http://schemas.microsoft.com/office/word/2015/wordml/symex" xmlns:wpi="http://schemas.microsoft.com/office/word/2010/wordprocessingInk" xmlns:wne="http://schemas.microsoft.com/office/word/2006/wordml" mc:Ignorable="w14 w15 w16se w16cid w16 w16cex w16sdtdh wne wp14" w:conformance="strict">
   <w:body>
     <w:p>
       <w:pPr>
@@ -292,7 +292,7 @@
         <w:t>Abstract</w:t>
       </w:r>
       <w:r>
-        <w:t xml:space="preserve">—This paper addresses a common blind spot in solar photovoltaic (PV) operations: a raw inverter power reading is not, by itself, diagnostic, since low output during a cloudy interval is normal and does not indicate a fault. We build a weather-conditioned expected-output model from irradiation, ambient and module temperature, and time of day, then use it as a physically grounded reference against which every inverter in a 22-unit fleet at a real Indian solar plant is scored. Eight regression approaches, spanning linear, ensemble, and neural models, plus a managed AutoML service, are compared under a chronological train-test split rather than a random one, which avoids the accuracy inflation that a random split produces on short-interval PV telemetry. The best models reach a test RMSE of about 64 kilowatts with an R-squared above 0.96. The trained model is then used to compute a performance ratio for each inverter, and a statistical control-chart rule flags two inverters whose output is persistently below the fleet norm across the entire 34-day study period. Five additional studies quantify cross-plant generalization, robustness to sensor noise and missing data, calibration of prediction intervals, feature-level interpretability, and inference latency. Each produces a specific, actionable finding rather than a single aggregate accuracy figure, and together they argue that evaluation design and honest reporting of failure modes matter more than model complexity for this class of problem.</w:t>
+        <w:t xml:space="preserve">—This paper addresses a common blind spot in solar photovoltaic (PV) operations: a raw inverter power reading is not, by itself, diagnostic, since low output during a cloudy interval is normal and does not indicate a fault. We build a weather-conditioned expected-output model from irradiation, ambient and module temperature, and time of day, then use it as a physically grounded reference against which every inverter in a 22-unit fleet at a real Indian solar plant is scored. Eight regression approaches, spanning linear, ensemble, and neural models, plus a managed AutoML service, are compared under a chronological train-test split, which tests genuine forecasting into an unseen future period rather than interpolation, and we show this choice of split changes which model class looks best more than it changes the achievable error level. The best models reach a test RMSE of about 64 kilowatts with an R-squared above 0.96. The trained model is then used to compute a performance ratio for each inverter, and a statistical control-chart rule flags two inverters whose output is persistently below the fleet norm across the entire 34-day study period. Five additional studies quantify cross-plant generalization, robustness to sensor noise and missing data, calibration of prediction intervals, feature-level interpretability, and inference latency. Each produces a specific, actionable finding rather than a single aggregate accuracy figure, and together they argue that evaluation design and honest reporting of failure modes matter more than model complexity for this class of problem.</w:t>
       </w:r>
     </w:p>
     <w:p>
@@ -316,7 +316,7 @@
         <w:pStyle w:val="a3"/>
       </w:pPr>
       <w:r>
-        <w:t>Grid-connected solar photovoltaic (PV) plants report inverter-level power output at short intervals, and that number is the natural starting point for any attempt to catch equipment problems early. The difficulty is that raw output alone is not diagnostic. An inverter producing little power on an overcast afternoon is behaving correctly, while the same output level on a clear, high-irradiance morning would point to soiling, partial shading, or a degraded electrical connection. Distinguishing the two cases requires a reference for what an inverter should be producing under the weather conditions actually observed at that moment, which is the basis of the performance ratio concept standardized for PV monitoring in IEC 61724-1 [2].</w:t>
+        <w:t>Grid-connected solar photovoltaic (PV) plants report inverter-level power output at short intervals, and that number is the natural starting point for any attempt to catch equipment problems early. The difficulty is that raw output alone is not diagnostic. An inverter producing little power on an overcast afternoon is behaving correctly, while the same output level on a clear, high-irradiance morning would point to soiling, partial shading, or a degraded electrical connection. Distinguishing the two cases requires a reference for what an inverter should be producing under the weather conditions actually observed at that moment, which is the basis of the performance ratio concept standardized for PV monitoring in IEC 61724-1 [1].</w:t>
       </w:r>
     </w:p>
     <w:p>
@@ -340,7 +340,7 @@
         <w:pStyle w:val="bulletlist"/>
       </w:pPr>
       <w:r>
-        <w:t>A direct comparison between a chronological and a random train-test split on the same 15-minute PV telemetry, showing that a random split materially overstates accuracy on this data.</w:t>
+        <w:t>A direct comparison between a chronological and a random train-test split on the same 15-minute PV telemetry, showing that split choice changes which model class appears best, not just the absolute error level.</w:t>
       </w:r>
     </w:p>
     <w:p>
@@ -380,7 +380,7 @@
         <w:pStyle w:val="a3"/>
       </w:pPr>
       <w:r>
-        <w:t>Photovoltaic power forecasting has a substantial literature; Antonanzas et al. [3] review over seventy forecasting studies and find that machine learning methods, particularly neural networks and tree-based ensembles, dominate recent work. That literature is concerned mainly with predicting future output for grid dispatch, which is a related but distinct problem from the one addressed here: we use a model of expected output not to forecast ahead in time, but to compare a real, present-time reading against what the same timestep's weather implies it should be.</w:t>
+        <w:t>Photovoltaic power forecasting has a substantial literature; Antonanzas et al. [2] survey a large body of forecasting techniques and report that machine learning methods, including neural networks and tree-based ensembles, account for a majority of the approaches reviewed. That literature is concerned mainly with predicting future output for grid dispatch, which is a related but distinct problem from the one addressed here: we use a model of expected output not to forecast ahead in time, but to compare a real, present-time reading against what the same timestep's weather implies it should be.</w:t>
       </w:r>
     </w:p>
     <w:p>
@@ -388,7 +388,7 @@
         <w:pStyle w:val="a3"/>
       </w:pPr>
       <w:r>
-        <w:t>Closer to the present work, Francisti et al. [4] apply machine learning to predictive modeling and anomaly detection in solar PV inverters, and Khandeparkar et al. [5] benchmark supervised classifiers, including random forest and XGBoost, for electrical fault detection in PV systems using simulated fault conditions. Both confirm that tree-based ensembles are effective for PV-related detection tasks. The present work differs in two respects: it derives underperformance labels from real telemetry through an expected-output model rather than simulated fault injection, and it reports a set of rigor studies, cross-plant transfer, sensor robustness, calibration, interpretability, and latency, that are not jointly reported in either study.</w:t>
+        <w:t>Closer to the present work, Francisti et al. [3] apply machine learning to predictive modeling and anomaly detection in solar PV inverters, and Khandeparkar et al. [4] benchmark supervised classifiers, including random forest and XGBoost, for electrical fault detection in PV systems using simulated fault conditions. Both confirm that tree-based ensembles are effective for PV-related detection tasks. The present work differs in two respects: it derives underperformance labels from real telemetry through an expected-output model rather than simulated fault injection, and it reports a set of rigor studies, cross-plant transfer, sensor robustness, calibration, interpretability, and latency, that are not jointly reported in either study.</w:t>
       </w:r>
     </w:p>
     <w:p>
@@ -396,7 +396,7 @@
         <w:pStyle w:val="a3"/>
       </w:pPr>
       <w:r>
-        <w:t>This work is also distinct from the authors' own prior work on open-set recognition for thermal infrared images of PV modules [17], which classifies visually identifiable fault types, including diode failures, hot spots, and soiling patterns, from thermal imagery and evaluates whether a classifier can recognize a fault type it has not been trained on. That work operates on image data and addresses fault-type classification; the present paper operates on numerical production telemetry and addresses fleet-level underperformance monitoring. The two are complementary views of PV predictive maintenance rather than overlapping contributions.</w:t>
+        <w:t>This work is also distinct from the authors' own prior work on open-set recognition for thermal infrared images of PV modules [5], which classifies visually identifiable fault types, including diode failures, hot spots, and soiling patterns, from thermal imagery and evaluates whether a classifier can recognize a fault type it has not been trained on. That work operates on image data and addresses fault-type classification; the present paper operates on numerical production telemetry and addresses fleet-level underperformance monitoring. The two are complementary views of PV predictive maintenance rather than overlapping contributions.</w:t>
       </w:r>
     </w:p>
     <w:p>
@@ -412,7 +412,7 @@
         <w:pStyle w:val="a3"/>
       </w:pPr>
       <w:r>
-        <w:t>We use a public dataset of two real solar plants in India, each instrumented with per-inverter generation logging and a single plant-level weather sensor, recorded at 15-minute intervals over 34 days from 15 May to 17 June 2020 [1]. Plant 1 has 22 inverters and is the primary subject of this study; Plant 2, also with 22 inverters but different hardware, is used only for the cross-plant generalization test in Section V-C. Generation data records DC power, AC power, and cumulative yield per inverter; weather data records ambient temperature, module temperature, and irradiation for the plant as a whole, which we join to each inverter's generation record by timestamp and plant identifier.</w:t>
+        <w:t>We use a public dataset of two real solar plants in India, each instrumented with per-inverter generation logging and a single plant-level weather sensor, recorded at 15-minute intervals over 34 days from 15 May to 17 June 2020 [6]. Plant 1 has 22 inverters and is the primary subject of this study; Plant 2, also with 22 inverters but different hardware, is used only for the cross-plant generalization test in Section V-C. Generation data records DC power, AC power, and cumulative yield per inverter; weather data records ambient temperature, module temperature, and irradiation for the plant as a whole, which we join to each inverter's generation record by timestamp and plant identifier.</w:t>
       </w:r>
     </w:p>
     <w:p>
@@ -452,7 +452,7 @@
         <w:pStyle w:val="a3"/>
       </w:pPr>
       <w:r>
-        <w:t>Eight models are compared: a naive mean baseline; ordinary linear regression; ridge regression; random forest [6]; XGBoost [7]; LightGBM [8]; a two-layer multilayer perceptron (MLP) implemented in PyTorch [15]; and a one-dimensional convolutional network (1D-CNN) operating on a four-step lag window of weather readings, also in PyTorch. Classical and ensemble models use scikit-learn [14]. As a managed-service comparison point, we additionally train a Vertex AI AutoML Tables regressor [16] on the identical split, motivated by the broader literature on automated machine learning [13].</w:t>
+        <w:t>Eight models are compared: a naive mean baseline; ordinary linear regression; ridge regression; random forest [7]; XGBoost [8]; LightGBM [9]; a two-layer multilayer perceptron (MLP) implemented in PyTorch [10]; and a one-dimensional convolutional network (1D-CNN) operating on a four-step lag window of weather readings, also in PyTorch. Classical and ensemble models use scikit-learn [11]. As a managed-service comparison point, we additionally train a Vertex AI AutoML Tables regressor [12] on the identical split, motivated by the broader literature on automated machine learning [13].</w:t>
       </w:r>
     </w:p>
     <w:p>
@@ -468,7 +468,7 @@
         <w:pStyle w:val="a3"/>
       </w:pPr>
       <w:r>
-        <w:t>The primary evaluation split is chronological: the first 24 days of Plant 1 are used for training and the remaining approximately 10 days for testing. This is a materially harder and more honest test than a random row-wise split, which would let daylight readings from the same or adjacent days appear on both sides of the split and inflate apparent accuracy through near-duplicate leakage. Night-time readings, where irradiation is zero, are excluded from all accuracy metrics, since a model that always predicts near zero at night would otherwise dominate the error statistics with a trivially solved portion of the data. Every stochastic model, random forest, XGBoost, LightGBM, MLP, and the 1D-CNN, is retrained under three random seeds, and we report the mean and standard deviation of test-set metrics across seeds; deterministic models have zero variance by construction.</w:t>
+        <w:t>The primary evaluation split is chronological: the first 24 days of Plant 1 are used for training and the remaining approximately 10 days for testing. This is a more honest test of deployment behavior than a random row-wise split, since it evaluates genuine forecasting into an unseen future period rather than interpolation between rows drawn from the same 34-day window; Section V-A reports a direct comparison against a random split and shows the two protocols disagree on which model class performs best, which is the more consequential effect of split choice here than any change in absolute error. Night-time readings, where irradiation is zero, are excluded from all accuracy metrics, since a model that always predicts near zero at night would otherwise dominate the error statistics with a trivially solved portion of the data. Every stochastic model, random forest, XGBoost, LightGBM, MLP, and the 1D-CNN, is retrained under three random seeds, and we report the mean and standard deviation of test-set metrics across seeds; deterministic models have zero variance by construction.</w:t>
       </w:r>
     </w:p>
     <w:p>
@@ -500,7 +500,7 @@
         <w:pStyle w:val="a3"/>
       </w:pPr>
       <w:r>
-        <w:t>Beyond the accuracy benchmark, five further studies are conducted using the same trained models. Cross-plant generalization trains on all of Plant 1 and evaluates zero-shot on Plant 2, testing whether the learned relationship transfers across different hardware and site conditions, in the spirit of the dataset-shift framework of Quinonero-Candela et al. [12]. Robustness to sensor degradation perturbs the three weather features with Gaussian noise at five severities and, separately, replaces an increasing fraction of readings with their training-set mean to simulate sensor dropout. Uncertainty calibration builds a 90 percent prediction interval from the 5th and 95th percentile spread of individual random forest tree predictions, following Meinshausen's quantile regression forests [10], and checks whether the empirical coverage on the held-out test set matches the nominal 90 percent. Interpretability computes SHAP values [9] for the random forest model and compares them against the model's built-in impurity-based feature importance, checking that the model has learned the correct physical driver of solar output rather than a spurious correlate. Deployability measures single-row inference latency and serialized model size for every model, as a proxy for suitability on edge or gateway hardware rather than a batch data-center job.</w:t>
+        <w:t>Beyond the accuracy benchmark, five further studies are conducted using the same trained models. Cross-plant generalization trains on all of Plant 1 and evaluates zero-shot on Plant 2, testing whether the learned relationship transfers across different hardware and site conditions, in the spirit of the dataset-shift framework of Quinonero-Candela et al. [14]. Robustness to sensor degradation perturbs the three weather features with Gaussian noise at five severities and, separately, replaces an increasing fraction of readings with their training-set mean to simulate sensor dropout. Uncertainty calibration builds a 90 percent prediction interval from the 5th and 95th percentile spread of individual random forest tree predictions, following Meinshausen's quantile regression forests [15], and checks whether the empirical coverage on the held-out test set matches the nominal 90 percent. Interpretability computes SHAP values [16] for the random forest model and compares them against the model's built-in impurity-based feature importance, checking that the model has learned the correct physical driver of solar output rather than a spurious correlate. Deployability measures single-row inference latency and serialized model size for every model, as a proxy for suitability on edge or gateway hardware rather than a batch data-center job.</w:t>
       </w:r>
     </w:p>
     <w:p>
@@ -1252,6 +1252,14 @@
     </w:p>
     <w:p>
       <w:pPr>
+        <w:pStyle w:val="a3"/>
+      </w:pPr>
+      <w:r>
+        <w:t>Split choice changes which model class looks best more than it changes the achievable error level. Under a random 80/20 row-wise split on the same daylight data, the tree ensembles (random forest 67.95 kW, XGBoost 67.78 kW, LightGBM 67.82 kW) outperform linear and ridge regression (76.25 and 76.24 kW) by roughly 12 percent. Under the chronological split used throughout this paper, that gap nearly disappears: linear regression (66.34 kW) comes within 2 percent of the tree ensembles (66.71 to 65.18 kW). Neither split is uniformly harder in an absolute sense here; the naive baseline itself scores slightly better under the chronological split (364.67 kW) than the random one (380.60 kW), since the final ten days happen to have less variable weather than a random 20 percent sample of the full window. The practical conclusion is methodological rather than about raw accuracy: a random split here would have credited model complexity with an advantage that a genuinely out-of-time evaluation does not support.</w:t>
+      </w:r>
+    </w:p>
+    <w:p>
+      <w:pPr>
         <w:pStyle w:val="2"/>
       </w:pPr>
       <w:r>
@@ -1612,7 +1620,7 @@
         <w:pStyle w:val="a3"/>
       </w:pPr>
       <w:r>
-        <w:t>A nominal 90 percent prediction interval built from the 5th to 95th percentile spread of individual random forest tree predictions achieves only 55.7 percent empirical coverage on the chronological test set, a substantial overconfidence. Tree-to-tree disagreement within one forest mostly reflects bootstrap and estimation variance rather than the full predictive uncertainty a genuinely out-of-time test period contains, so this interval should not be trusted at face value for a deployment alarm threshold. Conformal prediction [11] would provide a distribution-free coverage guarantee without relying on this internal variance as an uncertainty proxy, and is the natural next step before this model's uncertainty estimates are used operationally. The underperformance finding in Section V-B is not undermined by this miscalibration, since the flagged inverters' deficits, five to seven percent of expected output sustained over thirty-two to thirty-four days, are far larger and more durable than a single day's point-estimate error against daylight AC power readings that regularly exceed several hundred kilowatts.</w:t>
+        <w:t>A nominal 90 percent prediction interval built from the 5th to 95th percentile spread of individual random forest tree predictions achieves only 55.7 percent empirical coverage on the chronological test set, a substantial overconfidence. Tree-to-tree disagreement within one forest mostly reflects bootstrap and estimation variance rather than the full predictive uncertainty a genuinely out-of-time test period contains, so this interval should not be trusted at face value for a deployment alarm threshold. Conformal prediction [17] would provide a distribution-free coverage guarantee without relying on this internal variance as an uncertainty proxy, and is the natural next step before this model's uncertainty estimates are used operationally. The underperformance finding in Section V-B is not undermined by this miscalibration, since the flagged inverters' deficits, five to seven percent of expected output flagged on 30 to 32 of the 34 study days, are far larger and more durable than a single day's point-estimate error against daylight AC power readings that regularly exceed several hundred kilowatts.</w:t>
       </w:r>
     </w:p>
     <w:p>
@@ -1628,7 +1636,7 @@
         <w:pStyle w:val="a3"/>
       </w:pPr>
       <w:r>
-        <w:t>SHAP values [9] and the random forest's built-in impurity-based feature importance agree on ranking and are close in magnitude: irradiation accounts for 94.1 percent of mean absolute SHAP value and 99.2 percent of impurity-based importance, with ambient temperature, module temperature, and the two time-of-day encodings each contributing a few percent or less by either measure (Fig. 5). This agreement supports treating the model as a trustworthy expected-output reference: it has learned solar irradiance as the dominant physical driver of AC power, not a spurious correlate such as time of day.</w:t>
+        <w:t>SHAP values [16] and the random forest's built-in impurity-based feature importance agree on ranking and are close in magnitude: irradiation accounts for 94.1 percent of mean absolute SHAP value and 99.2 percent of impurity-based importance, with ambient temperature, module temperature, and the two time-of-day encodings each contributing a few percent or less by either measure (Fig. 5). This agreement supports treating the model as a trustworthy expected-output reference: it has learned solar irradiance as the dominant physical driver of AC power, not a spurious correlate such as time of day.</w:t>
       </w:r>
     </w:p>
     <w:p>
@@ -1716,7 +1724,7 @@
         <w:pStyle w:val="a3"/>
       </w:pPr>
       <w:r>
-        <w:t>Three observations recur across these results. First, model complexity is not the limiting factor for the regression task: a linear model comes within a few percent of the best ensemble, and a managed AutoML product matches a five-layer MLP after far more training time and cost. What matters more is getting the feature set and evaluation split right, since the chronological split alone changes the reported RMSE by roughly thirty percent relative to a random split on the same data. Second, the underperformance finding is the paper's most actionable result: two inverters with a sustained five to seven percent output deficit are a concrete maintenance target, identified without any labeled fault data, using only weather telemetry and a statistical control rule. Third, the weakest points of the system, cross-plant transfer and uncertainty calibration, are not weaknesses of the specific models chosen but of the problem framing, and both have a specific, cited remedy: capacity-normalized targets for the former, conformal calibration for the latter.</w:t>
+        <w:t>Three observations recur across these results. First, model complexity is not the limiting factor for the regression task: a linear model comes within a few percent of the best ensemble under the chronological split, and a managed AutoML product matches a five-layer MLP after far more training time and cost. What matters more is getting the feature set and evaluation split right: under a random split the tree ensembles hold a genuine edge over linear regression, and only the chronological split reveals that this edge does not survive a real train against a real, later test period. Second, the underperformance finding is the paper's most actionable result: two inverters with a sustained five to seven percent output deficit are a concrete maintenance target, identified without any labeled fault data, using only weather telemetry and a statistical control rule. Third, the weakest points of the system, cross-plant transfer and uncertainty calibration, are not weaknesses of the specific models chosen but of the problem framing, and both have a specific, cited remedy: capacity-normalized targets for the former, conformal calibration for the latter.</w:t>
       </w:r>
     </w:p>
     <w:p>
@@ -1748,7 +1756,7 @@
         <w:pStyle w:val="bulletlist"/>
       </w:pPr>
       <w:r>
-        <w:t>The tree-quantile prediction interval is not well calibrated under distribution shift; conformal prediction [11] is the recommended next step before uncertainty estimates are used for automated alarm thresholds.</w:t>
+        <w:t>The tree-quantile prediction interval is not well calibrated under distribution shift; conformal prediction [17] is the recommended next step before uncertainty estimates are used for automated alarm thresholds.</w:t>
       </w:r>
     </w:p>
     <w:p>
@@ -1804,6 +1812,46 @@
         <w:pStyle w:val="references"/>
       </w:pPr>
       <w:r>
+        <w:t>International Electrotechnical Commission, IEC 61724-1:2017, Photovoltaic system performance, Part 1: Monitoring. Geneva, Switzerland: IEC, 2017.</w:t>
+      </w:r>
+    </w:p>
+    <w:p>
+      <w:pPr>
+        <w:pStyle w:val="references"/>
+      </w:pPr>
+      <w:r>
+        <w:t>J. Antonanzas, N. Osorio, R. Escobar, R. Urraca, F. J. Martinez-de-Pison, and F. Antonanzas-Torres, "Review of photovoltaic power forecasting," Solar Energy, vol. 136, pp. 78-111, 2016.</w:t>
+      </w:r>
+    </w:p>
+    <w:p>
+      <w:pPr>
+        <w:pStyle w:val="references"/>
+      </w:pPr>
+      <w:r>
+        <w:t>J. Francisti, K. Fodor, Z. Balogh, and M. Magdin, "Predictive modeling and anomaly detection in solar PV inverters using machine learning," ScienceDirect, 2025.</w:t>
+      </w:r>
+    </w:p>
+    <w:p>
+      <w:pPr>
+        <w:pStyle w:val="references"/>
+      </w:pPr>
+      <w:r>
+        <w:t>V. Khandeparkar, Shreshtha, and S. K. Ramu, "Effectiveness of supervised machine learning models for electrical fault detection in solar PV systems," Scientific Reports, vol. 15, art. 34919, 2025.</w:t>
+      </w:r>
+    </w:p>
+    <w:p>
+      <w:pPr>
+        <w:pStyle w:val="references"/>
+      </w:pPr>
+      <w:r>
+        <w:t>B. Bhowmik, "Open-Set Evaluation of Thermal PV Fault Classifiers," GitHub repository, 2026. [Online]. Available: https://github.com/barnadeepb/open-set-solar-fault-detection</w:t>
+      </w:r>
+    </w:p>
+    <w:p>
+      <w:pPr>
+        <w:pStyle w:val="references"/>
+      </w:pPr>
+      <w:r>
         <w:t>J. Anikannal, "Solar Power Generation Data," Kaggle dataset, 2020. [Online]. Available: https://www.kaggle.com/datasets/anikannal/solar-power-generation-data</w:t>
       </w:r>
     </w:p>
@@ -1812,7 +1860,7 @@
         <w:pStyle w:val="references"/>
       </w:pPr>
       <w:r>
-        <w:t>International Electrotechnical Commission, IEC 61724-1:2017, Photovoltaic system performance, Part 1: Monitoring. Geneva, Switzerland: IEC, 2017.</w:t>
+        <w:t>L. Breiman, "Random forests," Machine Learning, vol. 45, pp. 5-32, 2001.</w:t>
       </w:r>
     </w:p>
     <w:p>
@@ -1820,7 +1868,7 @@
         <w:pStyle w:val="references"/>
       </w:pPr>
       <w:r>
-        <w:t>J. Antonanzas, N. Osorio, R. Escobar, R. Urraca, F. J. Martinez-de-Pison, and F. Antonanzas-Torres, "Review of photovoltaic power forecasting," Solar Energy, vol. 136, pp. 78-111, 2016.</w:t>
+        <w:t>T. Chen and C. Guestrin, "XGBoost: A scalable tree boosting system," in Proc. 22nd ACM SIGKDD Int. Conf. Knowledge Discovery and Data Mining, 2016, pp. 785-794.</w:t>
       </w:r>
     </w:p>
     <w:p>
@@ -1828,7 +1876,7 @@
         <w:pStyle w:val="references"/>
       </w:pPr>
       <w:r>
-        <w:t>J. Francisti, K. Fodor, Z. Balogh, and M. Magdin, "Predictive modeling and anomaly detection in solar PV inverters using machine learning," ScienceDirect, 2025.</w:t>
+        <w:t>G. Ke, Q. Meng, T. Finley, T. Wang, W. Chen, W. Ma, Q. Ye, and T.-Y. Liu, "LightGBM: A highly efficient gradient boosting decision tree," in Advances in Neural Information Processing Systems 30, 2017, pp. 3146-3154.</w:t>
       </w:r>
     </w:p>
     <w:p>
@@ -1836,7 +1884,7 @@
         <w:pStyle w:val="references"/>
       </w:pPr>
       <w:r>
-        <w:t>V. Khandeparkar, Shreshtha, and S. K. Ramu, "Effectiveness of supervised machine learning models for electrical fault detection in solar PV systems," Scientific Reports, vol. 15, art. 34919, 2025.</w:t>
+        <w:t>A. Paszke, S. Gross, F. Massa, A. Lerer, J. Bradbury, G. Chanan, T. Killeen, Z. Lin, N. Gimelshein, L. Antiga, A. Desmaison, A. Kopf, E. Yang, Z. DeVito, M. Raison, A. Tejani, S. Chilamkurthy, B. Steiner, L. Fang, J. Bai, and S. Chintala, "PyTorch: An imperative style, high-performance deep learning library," in Advances in Neural Information Processing Systems 32, 2019, pp. 8024-8035.</w:t>
       </w:r>
     </w:p>
     <w:p>
@@ -1844,7 +1892,7 @@
         <w:pStyle w:val="references"/>
       </w:pPr>
       <w:r>
-        <w:t>L. Breiman, "Random forests," Machine Learning, vol. 45, pp. 5-32, 2001.</w:t>
+        <w:t>F. Pedregosa, G. Varoquaux, A. Gramfort, V. Michel, B. Thirion, O. Grisel, M. Blondel, P. Prettenhofer, R. Weiss, V. Dubourg, J. VanderPlas, A. Passos, D. Cournapeau, M. Brucher, M. Perrot, and E. Duchesnay, "Scikit-learn: Machine learning in Python," Journal of Machine Learning Research, vol. 12, pp. 2825-2830, 2011.</w:t>
       </w:r>
     </w:p>
     <w:p>
@@ -1852,7 +1900,7 @@
         <w:pStyle w:val="references"/>
       </w:pPr>
       <w:r>
-        <w:t>T. Chen and C. Guestrin, "XGBoost: A scalable tree boosting system," in Proc. 22nd ACM SIGKDD Int. Conf. Knowledge Discovery and Data Mining, 2016, pp. 785-794.</w:t>
+        <w:t>Google Cloud, "Tabular Workflow for End-to-End AutoML," Vertex AI documentation. [Online]. Available: https://docs.cloud.google.com/vertex-ai/docs/tabular-data/tabular-workflows/e2e-automl</w:t>
       </w:r>
     </w:p>
     <w:p>
@@ -1860,7 +1908,7 @@
         <w:pStyle w:val="references"/>
       </w:pPr>
       <w:r>
-        <w:t>G. Ke, Q. Meng, T. Finley, T. Wang, W. Chen, W. Ma, Q. Ye, and T.-Y. Liu, "LightGBM: A highly efficient gradient boosting decision tree," in Advances in Neural Information Processing Systems 30, 2017, pp. 3146-3154.</w:t>
+        <w:t>X. He, K. Zhao, and X. Chu, "AutoML: A survey of the state-of-the-art," Knowledge-Based Systems, vol. 212, art. 106622, 2021.</w:t>
       </w:r>
     </w:p>
     <w:p>
@@ -1868,6 +1916,22 @@
         <w:pStyle w:val="references"/>
       </w:pPr>
       <w:r>
+        <w:t>J. Quinonero-Candela, M. Sugiyama, A. Schwaighofer, and N. D. Lawrence, Eds., Dataset Shift in Machine Learning. Cambridge, MA, USA: MIT Press, 2009.</w:t>
+      </w:r>
+    </w:p>
+    <w:p>
+      <w:pPr>
+        <w:pStyle w:val="references"/>
+      </w:pPr>
+      <w:r>
+        <w:t>N. Meinshausen, "Quantile regression forests," Journal of Machine Learning Research, vol. 7, pp. 983-999, 2006.</w:t>
+      </w:r>
+    </w:p>
+    <w:p>
+      <w:pPr>
+        <w:pStyle w:val="references"/>
+      </w:pPr>
+      <w:r>
         <w:t>S. M. Lundberg and S.-I. Lee, "A unified approach to interpreting model predictions," in Advances in Neural Information Processing Systems 30, 2017.</w:t>
       </w:r>
     </w:p>
@@ -1876,63 +1940,7 @@
         <w:pStyle w:val="references"/>
       </w:pPr>
       <w:r>
-        <w:t>N. Meinshausen, "Quantile regression forests," Journal of Machine Learning Research, vol. 7, pp. 983-999, 2006.</w:t>
-      </w:r>
-    </w:p>
-    <w:p>
-      <w:pPr>
-        <w:pStyle w:val="references"/>
-      </w:pPr>
-      <w:r>
         <w:t>A. N. Angelopoulos and S. Bates, "Conformal prediction: A gentle introduction," Foundations and Trends in Machine Learning, vol. 16, no. 4, pp. 494-591, 2023.</w:t>
-      </w:r>
-    </w:p>
-    <w:p>
-      <w:pPr>
-        <w:pStyle w:val="references"/>
-      </w:pPr>
-      <w:r>
-        <w:t>J. Quinonero-Candela, M. Sugiyama, A. Schwaighofer, and N. D. Lawrence, Eds., Dataset Shift in Machine Learning. Cambridge, MA, USA: MIT Press, 2009.</w:t>
-      </w:r>
-    </w:p>
-    <w:p>
-      <w:pPr>
-        <w:pStyle w:val="references"/>
-      </w:pPr>
-      <w:r>
-        <w:t>X. He, K. Zhao, and X. Chu, "AutoML: A survey of the state-of-the-art," Knowledge-Based Systems, vol. 212, art. 106622, 2021.</w:t>
-      </w:r>
-    </w:p>
-    <w:p>
-      <w:pPr>
-        <w:pStyle w:val="references"/>
-      </w:pPr>
-      <w:r>
-        <w:t>F. Pedregosa, G. Varoquaux, A. Gramfort, V. Michel, B. Thirion, O. Grisel, M. Blondel, P. Prettenhofer, R. Weiss, V. Dubourg, J. VanderPlas, A. Passos, D. Cournapeau, M. Brucher, M. Perrot, and E. Duchesnay, "Scikit-learn: Machine learning in Python," Journal of Machine Learning Research, vol. 12, pp. 2825-2830, 2011.</w:t>
-      </w:r>
-    </w:p>
-    <w:p>
-      <w:pPr>
-        <w:pStyle w:val="references"/>
-      </w:pPr>
-      <w:r>
-        <w:t>A. Paszke, S. Gross, F. Massa, A. Lerer, J. Bradbury, G. Chanan, T. Killeen, Z. Lin, N. Gimelshein, L. Antiga, A. Desmaison, A. Kopf, E. Yang, Z. DeVito, M. Raison, A. Tejani, S. Chilamkurthy, B. Steiner, L. Fang, J. Bai, and S. Chintala, "PyTorch: An imperative style, high-performance deep learning library," in Advances in Neural Information Processing Systems 32, 2019, pp. 8024-8035.</w:t>
-      </w:r>
-    </w:p>
-    <w:p>
-      <w:pPr>
-        <w:pStyle w:val="references"/>
-      </w:pPr>
-      <w:r>
-        <w:t>Google Cloud, "AutoML on Vertex AI, tabular data," Google Cloud documentation. [Online]. Available: https://cloud.google.com/vertex-ai/docs/tabular-data/tabular-workflows/introduction</w:t>
-      </w:r>
-    </w:p>
-    <w:p>
-      <w:pPr>
-        <w:pStyle w:val="references"/>
-      </w:pPr>
-      <w:r>
-        <w:t>B. Bhowmik, "Open-Set Evaluation of Thermal PV Fault Classifiers," GitHub repository, 2026. [Online]. Available: https://github.com/barnadeepb/open-set-solar-fault-detection</w:t>
       </w:r>
     </w:p>
     <w:p>
@@ -2640,7 +2648,7 @@
 </file>
 
 <file path=word/endnotes.xml><?xml version="1.0" encoding="utf-8"?>
-<w:endnotes xmlns:cx="http://schemas.microsoft.com/office/drawing/2014/chartex" xmlns:cx1="http://schemas.microsoft.com/office/drawing/2015/9/8/chartex" xmlns:cx2="http://schemas.microsoft.com/office/drawing/2015/10/21/chartex" xmlns:cx3="http://schemas.microsoft.com/office/drawing/2016/5/9/chartex" xmlns:cx4="http://schemas.microsoft.com/office/drawing/2016/5/10/chartex" xmlns:cx5="http://schemas.microsoft.com/office/drawing/2016/5/11/chartex" xmlns:cx6="http://schemas.microsoft.com/office/drawing/2016/5/12/chartex" xmlns:cx7="http://schemas.microsoft.com/office/drawing/2016/5/13/chartex" xmlns:cx8="http://schemas.microsoft.com/office/drawing/2016/5/14/chartex" xmlns:mc="http://schemas.openxmlformats.org/markup-compatibility/2006" xmlns:aink="http://schemas.microsoft.com/office/drawing/2016/ink" xmlns:am3d="http://schemas.microsoft.com/office/drawing/2017/model3d" xmlns:o="urn:schemas-microsoft-com:office:office" xmlns:oel="http://schemas.microsoft.com/office/2019/extlst" xmlns:r="http://purl.oclc.org/ooxml/officeDocument/relationships" xmlns:m="http://purl.oclc.org/ooxml/officeDocument/math" xmlns:v="urn:schemas-microsoft-com:vml" xmlns:wp14="http://schemas.microsoft.com/office/word/2010/wordprocessingDrawing" xmlns:wp="http://purl.oclc.org/ooxml/drawingml/wordprocessingDrawing" xmlns:w10="urn:schemas-microsoft-com:office:word" xmlns:w="http://purl.oclc.org/ooxml/wordprocessingml/main" xmlns:w14="http://schemas.microsoft.com/office/word/2010/wordml" xmlns:w15="http://schemas.microsoft.com/office/word/2012/wordml" xmlns:w16cex="http://schemas.microsoft.com/office/word/2018/wordml/cex" xmlns:w16cid="http://schemas.microsoft.com/office/word/2016/wordml/cid" xmlns:w16="http://schemas.microsoft.com/office/word/2018/wordml" xmlns:w16sdtdh="http://schemas.microsoft.com/office/word/2020/wordml/sdtdatahash" xmlns:w16se="http://schemas.microsoft.com/office/word/2015/wordml/symex" xmlns:wpi="http://schemas.microsoft.com/office/word/2010/wordprocessingInk" xmlns:wne="http://schemas.microsoft.com/office/word/2006/wordml" mc:Ignorable="w14 w15 w16se w16cid w16 w16cex w16sdtdh wne wp14">
+<w:endnotes xmlns:cx="http://schemas.microsoft.com/office/drawing/2014/chartex" xmlns:cx1="http://schemas.microsoft.com/office/drawing/2015/9/8/chartex" xmlns:cx2="http://schemas.microsoft.com/office/drawing/2015/10/21/chartex" xmlns:cx3="http://schemas.microsoft.com/office/drawing/2016/5/9/chartex" xmlns:cx4="http://schemas.microsoft.com/office/drawing/2016/5/10/chartex" xmlns:cx5="http://schemas.microsoft.com/office/drawing/2016/5/11/chartex" xmlns:cx6="http://schemas.microsoft.com/office/drawing/2016/5/12/chartex" xmlns:cx7="http://schemas.microsoft.com/office/drawing/2016/5/13/chartex" xmlns:cx8="http://schemas.microsoft.com/office/drawing/2016/5/14/chartex" xmlns:mc="http://schemas.openxmlformats.org/markup-compatibility/2006" xmlns:aink="http://schemas.microsoft.com/office/drawing/2016/ink" xmlns:am3d="http://schemas.microsoft.com/office/drawing/2017/model3d" xmlns:o="urn:schemas-microsoft-com:office:office" xmlns:oel="http://schemas.microsoft.com/office/2019/extlst" xmlns:r="http://schemas.openxmlformats.org/officeDocument/2006/relationships" xmlns:m="http://schemas.openxmlformats.org/officeDocument/2006/math" xmlns:v="urn:schemas-microsoft-com:vml" xmlns:wp14="http://schemas.microsoft.com/office/word/2010/wordprocessingDrawing" xmlns:wp="http://schemas.openxmlformats.org/drawingml/2006/wordprocessingDrawing" xmlns:w10="urn:schemas-microsoft-com:office:word" xmlns:w="http://schemas.openxmlformats.org/wordprocessingml/2006/main" xmlns:w14="http://schemas.microsoft.com/office/word/2010/wordml" xmlns:w15="http://schemas.microsoft.com/office/word/2012/wordml" xmlns:w16cex="http://schemas.microsoft.com/office/word/2018/wordml/cex" xmlns:w16cid="http://schemas.microsoft.com/office/word/2016/wordml/cid" xmlns:w16="http://schemas.microsoft.com/office/word/2018/wordml" xmlns:w16sdtdh="http://schemas.microsoft.com/office/word/2020/wordml/sdtdatahash" xmlns:w16se="http://schemas.microsoft.com/office/word/2015/wordml/symex" xmlns:wpi="http://schemas.microsoft.com/office/word/2010/wordprocessingInk" xmlns:wne="http://schemas.microsoft.com/office/word/2006/wordml" mc:Ignorable="w14 w15 w16se w16cid w16 w16cex w16sdtdh wne wp14">
   <w:endnote w:type="separator" w:id="-1">
     <w:p>
       <w:r>
@@ -2659,7 +2667,7 @@
 </file>
 
 <file path=word/footer1.xml><?xml version="1.0" encoding="utf-8"?>
-<w:ftr xmlns:cx="http://schemas.microsoft.com/office/drawing/2014/chartex" xmlns:cx1="http://schemas.microsoft.com/office/drawing/2015/9/8/chartex" xmlns:cx2="http://schemas.microsoft.com/office/drawing/2015/10/21/chartex" xmlns:cx3="http://schemas.microsoft.com/office/drawing/2016/5/9/chartex" xmlns:cx4="http://schemas.microsoft.com/office/drawing/2016/5/10/chartex" xmlns:cx5="http://schemas.microsoft.com/office/drawing/2016/5/11/chartex" xmlns:cx6="http://schemas.microsoft.com/office/drawing/2016/5/12/chartex" xmlns:cx7="http://schemas.microsoft.com/office/drawing/2016/5/13/chartex" xmlns:cx8="http://schemas.microsoft.com/office/drawing/2016/5/14/chartex" xmlns:mc="http://schemas.openxmlformats.org/markup-compatibility/2006" xmlns:aink="http://schemas.microsoft.com/office/drawing/2016/ink" xmlns:am3d="http://schemas.microsoft.com/office/drawing/2017/model3d" xmlns:o="urn:schemas-microsoft-com:office:office" xmlns:oel="http://schemas.microsoft.com/office/2019/extlst" xmlns:r="http://purl.oclc.org/ooxml/officeDocument/relationships" xmlns:m="http://purl.oclc.org/ooxml/officeDocument/math" xmlns:v="urn:schemas-microsoft-com:vml" xmlns:wp14="http://schemas.microsoft.com/office/word/2010/wordprocessingDrawing" xmlns:wp="http://purl.oclc.org/ooxml/drawingml/wordprocessingDrawing" xmlns:w10="urn:schemas-microsoft-com:office:word" xmlns:w="http://purl.oclc.org/ooxml/wordprocessingml/main" xmlns:w14="http://schemas.microsoft.com/office/word/2010/wordml" xmlns:w15="http://schemas.microsoft.com/office/word/2012/wordml" xmlns:w16cex="http://schemas.microsoft.com/office/word/2018/wordml/cex" xmlns:w16cid="http://schemas.microsoft.com/office/word/2016/wordml/cid" xmlns:w16="http://schemas.microsoft.com/office/word/2018/wordml" xmlns:w16sdtdh="http://schemas.microsoft.com/office/word/2020/wordml/sdtdatahash" xmlns:w16se="http://schemas.microsoft.com/office/word/2015/wordml/symex" xmlns:wpi="http://schemas.microsoft.com/office/word/2010/wordprocessingInk" xmlns:wne="http://schemas.microsoft.com/office/word/2006/wordml" mc:Ignorable="w14 w15 w16se w16cid w16 w16cex w16sdtdh wne wp14">
+<w:ftr xmlns:cx="http://schemas.microsoft.com/office/drawing/2014/chartex" xmlns:cx1="http://schemas.microsoft.com/office/drawing/2015/9/8/chartex" xmlns:cx2="http://schemas.microsoft.com/office/drawing/2015/10/21/chartex" xmlns:cx3="http://schemas.microsoft.com/office/drawing/2016/5/9/chartex" xmlns:cx4="http://schemas.microsoft.com/office/drawing/2016/5/10/chartex" xmlns:cx5="http://schemas.microsoft.com/office/drawing/2016/5/11/chartex" xmlns:cx6="http://schemas.microsoft.com/office/drawing/2016/5/12/chartex" xmlns:cx7="http://schemas.microsoft.com/office/drawing/2016/5/13/chartex" xmlns:cx8="http://schemas.microsoft.com/office/drawing/2016/5/14/chartex" xmlns:mc="http://schemas.openxmlformats.org/markup-compatibility/2006" xmlns:aink="http://schemas.microsoft.com/office/drawing/2016/ink" xmlns:am3d="http://schemas.microsoft.com/office/drawing/2017/model3d" xmlns:o="urn:schemas-microsoft-com:office:office" xmlns:oel="http://schemas.microsoft.com/office/2019/extlst" xmlns:r="http://schemas.openxmlformats.org/officeDocument/2006/relationships" xmlns:m="http://schemas.openxmlformats.org/officeDocument/2006/math" xmlns:v="urn:schemas-microsoft-com:vml" xmlns:wp14="http://schemas.microsoft.com/office/word/2010/wordprocessingDrawing" xmlns:wp="http://schemas.openxmlformats.org/drawingml/2006/wordprocessingDrawing" xmlns:w10="urn:schemas-microsoft-com:office:word" xmlns:w="http://schemas.openxmlformats.org/wordprocessingml/2006/main" xmlns:w14="http://schemas.microsoft.com/office/word/2010/wordml" xmlns:w15="http://schemas.microsoft.com/office/word/2012/wordml" xmlns:w16cex="http://schemas.microsoft.com/office/word/2018/wordml/cex" xmlns:w16cid="http://schemas.microsoft.com/office/word/2016/wordml/cid" xmlns:w16="http://schemas.microsoft.com/office/word/2018/wordml" xmlns:w16sdtdh="http://schemas.microsoft.com/office/word/2020/wordml/sdtdatahash" xmlns:w16se="http://schemas.microsoft.com/office/word/2015/wordml/symex" xmlns:wpi="http://schemas.microsoft.com/office/word/2010/wordprocessingInk" xmlns:wne="http://schemas.microsoft.com/office/word/2006/wordml" mc:Ignorable="w14 w15 w16se w16cid w16 w16cex w16sdtdh wne wp14">
   <w:p>
     <w:pPr>
       <w:pStyle w:val="a7"/>
@@ -2674,7 +2682,7 @@
 </file>
 
 <file path=word/footnotes.xml><?xml version="1.0" encoding="utf-8"?>
-<w:footnotes xmlns:cx="http://schemas.microsoft.com/office/drawing/2014/chartex" xmlns:cx1="http://schemas.microsoft.com/office/drawing/2015/9/8/chartex" xmlns:cx2="http://schemas.microsoft.com/office/drawing/2015/10/21/chartex" xmlns:cx3="http://schemas.microsoft.com/office/drawing/2016/5/9/chartex" xmlns:cx4="http://schemas.microsoft.com/office/drawing/2016/5/10/chartex" xmlns:cx5="http://schemas.microsoft.com/office/drawing/2016/5/11/chartex" xmlns:cx6="http://schemas.microsoft.com/office/drawing/2016/5/12/chartex" xmlns:cx7="http://schemas.microsoft.com/office/drawing/2016/5/13/chartex" xmlns:cx8="http://schemas.microsoft.com/office/drawing/2016/5/14/chartex" xmlns:mc="http://schemas.openxmlformats.org/markup-compatibility/2006" xmlns:aink="http://schemas.microsoft.com/office/drawing/2016/ink" xmlns:am3d="http://schemas.microsoft.com/office/drawing/2017/model3d" xmlns:o="urn:schemas-microsoft-com:office:office" xmlns:oel="http://schemas.microsoft.com/office/2019/extlst" xmlns:r="http://purl.oclc.org/ooxml/officeDocument/relationships" xmlns:m="http://purl.oclc.org/ooxml/officeDocument/math" xmlns:v="urn:schemas-microsoft-com:vml" xmlns:wp14="http://schemas.microsoft.com/office/word/2010/wordprocessingDrawing" xmlns:wp="http://purl.oclc.org/ooxml/drawingml/wordprocessingDrawing" xmlns:w10="urn:schemas-microsoft-com:office:word" xmlns:w="http://purl.oclc.org/ooxml/wordprocessingml/main" xmlns:w14="http://schemas.microsoft.com/office/word/2010/wordml" xmlns:w15="http://schemas.microsoft.com/office/word/2012/wordml" xmlns:w16cex="http://schemas.microsoft.com/office/word/2018/wordml/cex" xmlns:w16cid="http://schemas.microsoft.com/office/word/2016/wordml/cid" xmlns:w16="http://schemas.microsoft.com/office/word/2018/wordml" xmlns:w16sdtdh="http://schemas.microsoft.com/office/word/2020/wordml/sdtdatahash" xmlns:w16se="http://schemas.microsoft.com/office/word/2015/wordml/symex" xmlns:wpi="http://schemas.microsoft.com/office/word/2010/wordprocessingInk" xmlns:wne="http://schemas.microsoft.com/office/word/2006/wordml" mc:Ignorable="w14 w15 w16se w16cid w16 w16cex w16sdtdh wne wp14">
+<w:footnotes xmlns:cx="http://schemas.microsoft.com/office/drawing/2014/chartex" xmlns:cx1="http://schemas.microsoft.com/office/drawing/2015/9/8/chartex" xmlns:cx2="http://schemas.microsoft.com/office/drawing/2015/10/21/chartex" xmlns:cx3="http://schemas.microsoft.com/office/drawing/2016/5/9/chartex" xmlns:cx4="http://schemas.microsoft.com/office/drawing/2016/5/10/chartex" xmlns:cx5="http://schemas.microsoft.com/office/drawing/2016/5/11/chartex" xmlns:cx6="http://schemas.microsoft.com/office/drawing/2016/5/12/chartex" xmlns:cx7="http://schemas.microsoft.com/office/drawing/2016/5/13/chartex" xmlns:cx8="http://schemas.microsoft.com/office/drawing/2016/5/14/chartex" xmlns:mc="http://schemas.openxmlformats.org/markup-compatibility/2006" xmlns:aink="http://schemas.microsoft.com/office/drawing/2016/ink" xmlns:am3d="http://schemas.microsoft.com/office/drawing/2017/model3d" xmlns:o="urn:schemas-microsoft-com:office:office" xmlns:oel="http://schemas.microsoft.com/office/2019/extlst" xmlns:r="http://schemas.openxmlformats.org/officeDocument/2006/relationships" xmlns:m="http://schemas.openxmlformats.org/officeDocument/2006/math" xmlns:v="urn:schemas-microsoft-com:vml" xmlns:wp14="http://schemas.microsoft.com/office/word/2010/wordprocessingDrawing" xmlns:wp="http://schemas.openxmlformats.org/drawingml/2006/wordprocessingDrawing" xmlns:w10="urn:schemas-microsoft-com:office:word" xmlns:w="http://schemas.openxmlformats.org/wordprocessingml/2006/main" xmlns:w14="http://schemas.microsoft.com/office/word/2010/wordml" xmlns:w15="http://schemas.microsoft.com/office/word/2012/wordml" xmlns:w16cex="http://schemas.microsoft.com/office/word/2018/wordml/cex" xmlns:w16cid="http://schemas.microsoft.com/office/word/2016/wordml/cid" xmlns:w16="http://schemas.microsoft.com/office/word/2018/wordml" xmlns:w16sdtdh="http://schemas.microsoft.com/office/word/2020/wordml/sdtdatahash" xmlns:w16se="http://schemas.microsoft.com/office/word/2015/wordml/symex" xmlns:wpi="http://schemas.microsoft.com/office/word/2010/wordprocessingInk" xmlns:wne="http://schemas.microsoft.com/office/word/2006/wordml" mc:Ignorable="w14 w15 w16se w16cid w16 w16cex w16sdtdh wne wp14">
   <w:footnote w:type="separator" w:id="-1">
     <w:p>
       <w:r>
@@ -2693,7 +2701,7 @@
 </file>
 
 <file path=word/numbering.xml><?xml version="1.0" encoding="utf-8"?>
-<w:numbering xmlns:cx="http://schemas.microsoft.com/office/drawing/2014/chartex" xmlns:cx1="http://schemas.microsoft.com/office/drawing/2015/9/8/chartex" xmlns:cx2="http://schemas.microsoft.com/office/drawing/2015/10/21/chartex" xmlns:cx3="http://schemas.microsoft.com/office/drawing/2016/5/9/chartex" xmlns:cx4="http://schemas.microsoft.com/office/drawing/2016/5/10/chartex" xmlns:cx5="http://schemas.microsoft.com/office/drawing/2016/5/11/chartex" xmlns:cx6="http://schemas.microsoft.com/office/drawing/2016/5/12/chartex" xmlns:cx7="http://schemas.microsoft.com/office/drawing/2016/5/13/chartex" xmlns:cx8="http://schemas.microsoft.com/office/drawing/2016/5/14/chartex" xmlns:mc="http://schemas.openxmlformats.org/markup-compatibility/2006" xmlns:aink="http://schemas.microsoft.com/office/drawing/2016/ink" xmlns:am3d="http://schemas.microsoft.com/office/drawing/2017/model3d" xmlns:o="urn:schemas-microsoft-com:office:office" xmlns:oel="http://schemas.microsoft.com/office/2019/extlst" xmlns:r="http://purl.oclc.org/ooxml/officeDocument/relationships" xmlns:m="http://purl.oclc.org/ooxml/officeDocument/math" xmlns:v="urn:schemas-microsoft-com:vml" xmlns:wp14="http://schemas.microsoft.com/office/word/2010/wordprocessingDrawing" xmlns:wp="http://purl.oclc.org/ooxml/drawingml/wordprocessingDrawing" xmlns:w10="urn:schemas-microsoft-com:office:word" xmlns:w="http://purl.oclc.org/ooxml/wordprocessingml/main" xmlns:w14="http://schemas.microsoft.com/office/word/2010/wordml" xmlns:w15="http://schemas.microsoft.com/office/word/2012/wordml" xmlns:w16cex="http://schemas.microsoft.com/office/word/2018/wordml/cex" xmlns:w16cid="http://schemas.microsoft.com/office/word/2016/wordml/cid" xmlns:w16="http://schemas.microsoft.com/office/word/2018/wordml" xmlns:w16sdtdh="http://schemas.microsoft.com/office/word/2020/wordml/sdtdatahash" xmlns:w16se="http://schemas.microsoft.com/office/word/2015/wordml/symex" xmlns:wpi="http://schemas.microsoft.com/office/word/2010/wordprocessingInk" xmlns:wne="http://schemas.microsoft.com/office/word/2006/wordml" mc:Ignorable="w14 w15 w16se w16cid w16 w16cex w16sdtdh wne wp14">
+<w:numbering xmlns:cx="http://schemas.microsoft.com/office/drawing/2014/chartex" xmlns:cx1="http://schemas.microsoft.com/office/drawing/2015/9/8/chartex" xmlns:cx2="http://schemas.microsoft.com/office/drawing/2015/10/21/chartex" xmlns:cx3="http://schemas.microsoft.com/office/drawing/2016/5/9/chartex" xmlns:cx4="http://schemas.microsoft.com/office/drawing/2016/5/10/chartex" xmlns:cx5="http://schemas.microsoft.com/office/drawing/2016/5/11/chartex" xmlns:cx6="http://schemas.microsoft.com/office/drawing/2016/5/12/chartex" xmlns:cx7="http://schemas.microsoft.com/office/drawing/2016/5/13/chartex" xmlns:cx8="http://schemas.microsoft.com/office/drawing/2016/5/14/chartex" xmlns:mc="http://schemas.openxmlformats.org/markup-compatibility/2006" xmlns:aink="http://schemas.microsoft.com/office/drawing/2016/ink" xmlns:am3d="http://schemas.microsoft.com/office/drawing/2017/model3d" xmlns:o="urn:schemas-microsoft-com:office:office" xmlns:oel="http://schemas.microsoft.com/office/2019/extlst" xmlns:r="http://schemas.openxmlformats.org/officeDocument/2006/relationships" xmlns:m="http://schemas.openxmlformats.org/officeDocument/2006/math" xmlns:v="urn:schemas-microsoft-com:vml" xmlns:wp14="http://schemas.microsoft.com/office/word/2010/wordprocessingDrawing" xmlns:wp="http://schemas.openxmlformats.org/drawingml/2006/wordprocessingDrawing" xmlns:w10="urn:schemas-microsoft-com:office:word" xmlns:w="http://schemas.openxmlformats.org/wordprocessingml/2006/main" xmlns:w14="http://schemas.microsoft.com/office/word/2010/wordml" xmlns:w15="http://schemas.microsoft.com/office/word/2012/wordml" xmlns:w16cex="http://schemas.microsoft.com/office/word/2018/wordml/cex" xmlns:w16cid="http://schemas.microsoft.com/office/word/2016/wordml/cid" xmlns:w16="http://schemas.microsoft.com/office/word/2018/wordml" xmlns:w16sdtdh="http://schemas.microsoft.com/office/word/2020/wordml/sdtdatahash" xmlns:w16se="http://schemas.microsoft.com/office/word/2015/wordml/symex" xmlns:wpi="http://schemas.microsoft.com/office/word/2010/wordprocessingInk" xmlns:wne="http://schemas.microsoft.com/office/word/2006/wordml" mc:Ignorable="w14 w15 w16se w16cid w16 w16cex w16sdtdh wne wp14">
   <w:abstractNum w:abstractNumId="0" w15:restartNumberingAfterBreak="0">
     <w:nsid w:val="FFFFFF1D"/>
     <w:multiLevelType w:val="multilevel"/>
@@ -4161,7 +4169,7 @@
 </file>
 
 <file path=word/styles.xml><?xml version="1.0" encoding="utf-8"?>
-<w:styles xmlns:mc="http://schemas.openxmlformats.org/markup-compatibility/2006" xmlns:r="http://purl.oclc.org/ooxml/officeDocument/relationships" xmlns:w="http://purl.oclc.org/ooxml/wordprocessingml/main" xmlns:w14="http://schemas.microsoft.com/office/word/2010/wordml" xmlns:w15="http://schemas.microsoft.com/office/word/2012/wordml" xmlns:w16cex="http://schemas.microsoft.com/office/word/2018/wordml/cex" xmlns:w16cid="http://schemas.microsoft.com/office/word/2016/wordml/cid" xmlns:w16="http://schemas.microsoft.com/office/word/2018/wordml" xmlns:w16sdtdh="http://schemas.microsoft.com/office/word/2020/wordml/sdtdatahash" xmlns:w16se="http://schemas.microsoft.com/office/word/2015/wordml/symex" mc:Ignorable="w14 w15 w16se w16cid w16 w16cex w16sdtdh">
+<w:styles xmlns:mc="http://schemas.openxmlformats.org/markup-compatibility/2006" xmlns:r="http://schemas.openxmlformats.org/officeDocument/2006/relationships" xmlns:w="http://schemas.openxmlformats.org/wordprocessingml/2006/main" xmlns:w14="http://schemas.microsoft.com/office/word/2010/wordml" xmlns:w15="http://schemas.microsoft.com/office/word/2012/wordml" xmlns:w16cex="http://schemas.microsoft.com/office/word/2018/wordml/cex" xmlns:w16cid="http://schemas.microsoft.com/office/word/2016/wordml/cid" xmlns:w16="http://schemas.microsoft.com/office/word/2018/wordml" xmlns:w16sdtdh="http://schemas.microsoft.com/office/word/2020/wordml/sdtdatahash" xmlns:w16se="http://schemas.microsoft.com/office/word/2015/wordml/symex" mc:Ignorable="w14 w15 w16se w16cid w16 w16cex w16sdtdh">
   <w:docDefaults>
     <w:rPrDefault>
       <w:rPr>
@@ -5123,7 +5131,7 @@
 </file>
 
 <file path=word/theme/theme1.xml><?xml version="1.0" encoding="utf-8"?>
-<a:theme xmlns:a="http://purl.oclc.org/ooxml/drawingml/main" name="Office Theme">
+<a:theme xmlns:a="http://schemas.openxmlformats.org/drawingml/2006/main" name="Office Theme">
   <a:themeElements>
     <a:clrScheme name="Office">
       <a:dk1>
@@ -5388,7 +5396,7 @@
 </file>
 
 <file path=customXml/itemProps1.xml><?xml version="1.0" encoding="utf-8"?>
-<ds:datastoreItem xmlns:ds="http://purl.oclc.org/ooxml/officeDocument/customXml" ds:itemID="{174953BD-B001-433D-BAEA-84E6680CEBE7}">
+<ds:datastoreItem xmlns:ds="http://schemas.openxmlformats.org/officeDocument/2006/customXml" ds:itemID="{174953BD-B001-433D-BAEA-84E6680CEBE7}">
   <ds:schemaRefs>
     <ds:schemaRef ds:uri="http://schemas.openxmlformats.org/officeDocument/2006/bibliography"/>
   </ds:schemaRefs>

</xml_diff>